<commit_message>
tennctapp answering, opening, reply briefs: re-rendered on the model, still reported; reasons updated (xeschola's bold test, a dash after a parenthesis, a justified URL break; Schola's space in Word) (fb-595.54.63)
Co-Authored-By: Claude Opus 5.5 <noreply@anthropic.com>
</commit_message>
<xml_diff>
--- a/courts/sixth-circuit/tennessee/state/court-of-appeals/opening-brief/usage/OUTPUT-opening-brief.docx
+++ b/courts/sixth-circuit/tennessee/state/court-of-appeals/opening-brief/usage/OUTPUT-opening-brief.docx
@@ -8389,13 +8389,7 @@
         <w:t xml:space="preserve">Child Welfare Policy Manual</w:t>
       </w:r>
       <w:r>
-        <w:t xml:space="preserve">, U.S. Dep’t of Health &amp; Hum. Servs., § 2.1A.4, Question/​Answer 8 (Sept. 2012), https://​perma.​cc/​R6HH</w:t>
-      </w:r>
-      <w:r>
-        <w:noBreakHyphen/>
-      </w:r>
-      <w:r>
-        <w:t xml:space="preserve">5N9Q. Both the plain language of Tenn. Code Ann. § 37-⁠5-⁠107(c)⁠(4)⁠(C) and the prefatory reference to CAPTA in Tenn. Code Ann. § 37-⁠5-⁠107(c)⁠(4)⁠(A) demonstrate the intent of the General Assembly to provide for release of DCS’s full case file when a child dies from abuse or neglect with redactions to that full case file being limited to those found in Tenn. Code Ann. § 37-⁠5-⁠107. Redactions based on provisions outside of Tenn. Code Ann. § 37-⁠5-⁠107 are not permitted.</w:t>
+        <w:t xml:space="preserve">, U.S. Dep’t of Health &amp; Hum. Servs., § 2.1A.4, Question/​Answer 8 (Sept. 2012), https://​perma.​cc/​R6HH-⁠5N9Q. Both the plain language of Tenn. Code Ann. § 37-⁠5-⁠107(c)⁠(4)⁠(C) and the prefatory reference to CAPTA in Tenn. Code Ann. § 37-⁠5-⁠107(c)⁠(4)⁠(A) demonstrate the intent of the General Assembly to provide for release of DCS’s full case file when a child dies from abuse or neglect with redactions to that full case file being limited to those found in Tenn. Code Ann. § 37-⁠5-⁠107. Redactions based on provisions outside of Tenn. Code Ann. § 37-⁠5-⁠107 are not permitted.</w:t>
       </w:r>
     </w:p>
     <w:p>
@@ -13897,7 +13891,7 @@
         <w:t xml:space="preserve"> </w:t>
       </w:r>
       <w:r>
-        <w:t xml:space="preserve">§ 37-⁠⁠5-⁠⁠107(g)–⁠⁠(h). These provisions are not at issue in this case.</w:t>
+        <w:t xml:space="preserve">§ 37-⁠5-⁠107(g)–⁠(h). These provisions are not at issue in this case.</w:t>
       </w:r>
     </w:p>
   </w:footnote>

</xml_diff>